<commit_message>
se agrega nuevos documentos, documento de riesgos y la presentacion del proyecto
</commit_message>
<xml_diff>
--- a/Documentos/CRM DE PPS Documentación Técnica.docx
+++ b/Documentos/CRM DE PPS Documentación Técnica.docx
@@ -68,12 +68,46 @@
     </w:p>
     <w:p>
       <w:pPr>
+        <w:pStyle w:val="Title"/>
+        <w:keepNext w:val="1"/>
+        <w:keepLines w:val="1"/>
+        <w:pageBreakBefore w:val="0"/>
+        <w:widowControl w:val="1"/>
+        <w:pBdr>
+          <w:top w:space="0" w:sz="0" w:val="nil"/>
+          <w:left w:space="0" w:sz="0" w:val="nil"/>
+          <w:bottom w:space="0" w:sz="0" w:val="nil"/>
+          <w:right w:space="0" w:sz="0" w:val="nil"/>
+          <w:between w:space="0" w:sz="0" w:val="nil"/>
+        </w:pBdr>
+        <w:shd w:fill="auto" w:val="clear"/>
+        <w:spacing w:after="60" w:before="0" w:line="276" w:lineRule="auto"/>
+        <w:ind w:left="0" w:right="0" w:firstLine="0"/>
+        <w:jc w:val="center"/>
+        <w:rPr>
+          <w:sz w:val="40"/>
+          <w:szCs w:val="40"/>
+        </w:rPr>
+      </w:pPr>
+      <w:bookmarkStart w:colFirst="0" w:colLast="0" w:name="_s76fhrpprtmk" w:id="2"/>
+      <w:bookmarkEnd w:id="2"/>
+      <w:r>
+        <w:rPr>
+          <w:sz w:val="40"/>
+          <w:szCs w:val="40"/>
+          <w:rtl w:val="0"/>
+        </w:rPr>
+        <w:t xml:space="preserve">Cernadas Santiago Nicolas</w:t>
+      </w:r>
+    </w:p>
+    <w:p>
+      <w:pPr>
         <w:pStyle w:val="Subtitle"/>
         <w:jc w:val="center"/>
         <w:rPr/>
       </w:pPr>
-      <w:bookmarkStart w:colFirst="0" w:colLast="0" w:name="_5rwb3de25ie7" w:id="2"/>
-      <w:bookmarkEnd w:id="2"/>
+      <w:bookmarkStart w:colFirst="0" w:colLast="0" w:name="_5rwb3de25ie7" w:id="3"/>
+      <w:bookmarkEnd w:id="3"/>
       <w:r>
         <w:rPr>
           <w:rtl w:val="0"/>
@@ -90,7 +124,7 @@
         <w:rPr>
           <w:rtl w:val="0"/>
         </w:rPr>
-        <w:t xml:space="preserve">Versión 1.01 (Última modificación: 23/12/2025)</w:t>
+        <w:t xml:space="preserve">Versión 1.02 (Última modificación: 26/02/2026)</w:t>
       </w:r>
     </w:p>
     <w:p>
@@ -120,8 +154,8 @@
           <w:u w:val="single"/>
         </w:rPr>
       </w:pPr>
-      <w:bookmarkStart w:colFirst="0" w:colLast="0" w:name="_pjxa9fmr45tv" w:id="3"/>
-      <w:bookmarkEnd w:id="3"/>
+      <w:bookmarkStart w:colFirst="0" w:colLast="0" w:name="_pjxa9fmr45tv" w:id="4"/>
+      <w:bookmarkEnd w:id="4"/>
       <w:r>
         <w:rPr>
           <w:u w:val="single"/>
@@ -168,8 +202,8 @@
           <w:u w:val="single"/>
         </w:rPr>
       </w:pPr>
-      <w:bookmarkStart w:colFirst="0" w:colLast="0" w:name="_896c4tw19lkb" w:id="4"/>
-      <w:bookmarkEnd w:id="4"/>
+      <w:bookmarkStart w:colFirst="0" w:colLast="0" w:name="_896c4tw19lkb" w:id="5"/>
+      <w:bookmarkEnd w:id="5"/>
       <w:r>
         <w:rPr>
           <w:u w:val="single"/>
@@ -378,8 +412,8 @@
           <w:u w:val="single"/>
         </w:rPr>
       </w:pPr>
-      <w:bookmarkStart w:colFirst="0" w:colLast="0" w:name="_hznkmimwwljh" w:id="5"/>
-      <w:bookmarkEnd w:id="5"/>
+      <w:bookmarkStart w:colFirst="0" w:colLast="0" w:name="_hznkmimwwljh" w:id="6"/>
+      <w:bookmarkEnd w:id="6"/>
       <w:r>
         <w:rPr>
           <w:u w:val="single"/>
@@ -543,8 +577,8 @@
           <w:u w:val="single"/>
         </w:rPr>
       </w:pPr>
-      <w:bookmarkStart w:colFirst="0" w:colLast="0" w:name="_hew57vdyj0f5" w:id="6"/>
-      <w:bookmarkEnd w:id="6"/>
+      <w:bookmarkStart w:colFirst="0" w:colLast="0" w:name="_hew57vdyj0f5" w:id="7"/>
+      <w:bookmarkEnd w:id="7"/>
       <w:r>
         <w:rPr>
           <w:u w:val="single"/>
@@ -591,8 +625,8 @@
           <w:u w:val="single"/>
         </w:rPr>
       </w:pPr>
-      <w:bookmarkStart w:colFirst="0" w:colLast="0" w:name="_shb3oel1otpf" w:id="7"/>
-      <w:bookmarkEnd w:id="7"/>
+      <w:bookmarkStart w:colFirst="0" w:colLast="0" w:name="_shb3oel1otpf" w:id="8"/>
+      <w:bookmarkEnd w:id="8"/>
       <w:r>
         <w:rPr>
           <w:u w:val="single"/>
@@ -774,8 +808,8 @@
           <w:u w:val="single"/>
         </w:rPr>
       </w:pPr>
-      <w:bookmarkStart w:colFirst="0" w:colLast="0" w:name="_f3xu9czd1kyt" w:id="8"/>
-      <w:bookmarkEnd w:id="8"/>
+      <w:bookmarkStart w:colFirst="0" w:colLast="0" w:name="_f3xu9czd1kyt" w:id="9"/>
+      <w:bookmarkEnd w:id="9"/>
       <w:r>
         <w:rPr>
           <w:rtl w:val="0"/>
@@ -789,8 +823,8 @@
           <w:u w:val="single"/>
         </w:rPr>
       </w:pPr>
-      <w:bookmarkStart w:colFirst="0" w:colLast="0" w:name="_og0o4gvwsgp5" w:id="9"/>
-      <w:bookmarkEnd w:id="9"/>
+      <w:bookmarkStart w:colFirst="0" w:colLast="0" w:name="_og0o4gvwsgp5" w:id="10"/>
+      <w:bookmarkEnd w:id="10"/>
       <w:r>
         <w:rPr>
           <w:rtl w:val="0"/>
@@ -804,8 +838,8 @@
           <w:u w:val="single"/>
         </w:rPr>
       </w:pPr>
-      <w:bookmarkStart w:colFirst="0" w:colLast="0" w:name="_rdo5qgxubuto" w:id="10"/>
-      <w:bookmarkEnd w:id="10"/>
+      <w:bookmarkStart w:colFirst="0" w:colLast="0" w:name="_rdo5qgxubuto" w:id="11"/>
+      <w:bookmarkEnd w:id="11"/>
       <w:r>
         <w:rPr>
           <w:rtl w:val="0"/>
@@ -819,8 +853,8 @@
           <w:u w:val="single"/>
         </w:rPr>
       </w:pPr>
-      <w:bookmarkStart w:colFirst="0" w:colLast="0" w:name="_81412w9r14k1" w:id="11"/>
-      <w:bookmarkEnd w:id="11"/>
+      <w:bookmarkStart w:colFirst="0" w:colLast="0" w:name="_81412w9r14k1" w:id="12"/>
+      <w:bookmarkEnd w:id="12"/>
       <w:r>
         <w:rPr>
           <w:u w:val="single"/>
@@ -1490,8 +1524,8 @@
           <w:u w:val="single"/>
         </w:rPr>
       </w:pPr>
-      <w:bookmarkStart w:colFirst="0" w:colLast="0" w:name="_d7d6ysjmngia" w:id="12"/>
-      <w:bookmarkEnd w:id="12"/>
+      <w:bookmarkStart w:colFirst="0" w:colLast="0" w:name="_d7d6ysjmngia" w:id="13"/>
+      <w:bookmarkEnd w:id="13"/>
       <w:r>
         <w:rPr>
           <w:u w:val="single"/>
@@ -1598,8 +1632,8 @@
           <w:u w:val="single"/>
         </w:rPr>
       </w:pPr>
-      <w:bookmarkStart w:colFirst="0" w:colLast="0" w:name="_gx5qajc39u5b" w:id="13"/>
-      <w:bookmarkEnd w:id="13"/>
+      <w:bookmarkStart w:colFirst="0" w:colLast="0" w:name="_gx5qajc39u5b" w:id="14"/>
+      <w:bookmarkEnd w:id="14"/>
       <w:r>
         <w:rPr>
           <w:u w:val="single"/>
@@ -5489,8 +5523,8 @@
           <w:u w:val="single"/>
         </w:rPr>
       </w:pPr>
-      <w:bookmarkStart w:colFirst="0" w:colLast="0" w:name="_f94niaho2mgn" w:id="14"/>
-      <w:bookmarkEnd w:id="14"/>
+      <w:bookmarkStart w:colFirst="0" w:colLast="0" w:name="_f94niaho2mgn" w:id="15"/>
+      <w:bookmarkEnd w:id="15"/>
       <w:r>
         <w:rPr>
           <w:u w:val="single"/>

</xml_diff>